<commit_message>
Build Word files in the request and make PDFs an opt-in background task
The documents step could still time out: every PDF conversion and the table
of contents update run LibreOffice, and the background path depends on a
working Celery/RabbitMQ queue. Word files are now rendered directly (a few
seconds, no LibreOffice), the trust's contents list is generated text instead
of a Word field, and PDF copies are an opt-in that uses the background task,
with a Word-only fallback link on the waiting screen.

Co-Authored-By: Claude Opus 5.5 <noreply@anthropic.com>
Claude-Session: https://claude.ai/code/session_01KuaQkB2i4NiaYfRpxJzSXB
</commit_message>
<xml_diff>
--- a/docassemble/cphrlt/data/templates/certification_of_trust.docx
+++ b/docassemble/cphrlt/data/templates/certification_of_trust.docx
@@ -12873,6 +12873,23 @@
       <w:sz w:val="2"/>
     </w:rPr>
   </w:style>
+  <w:style w:type="paragraph" w:customStyle="1" w:styleId="ContentsLine">
+    <w:name w:val="Contents Line"/>
+    <w:basedOn w:val="Normal"/>
+    <w:pPr>
+      <w:keepNext w:val="0"/>
+      <w:tabs>
+        <w:tab w:pos="3744" w:val="left"/>
+      </w:tabs>
+      <w:spacing w:after="60"/>
+      <w:ind w:left="1440"/>
+    </w:pPr>
+    <w:rPr>
+      <w:rFonts w:ascii="Times New Roman" w:hAnsi="Times New Roman" w:eastAsia="Times New Roman" w:cs="Times New Roman"/>
+      <w:color w:val="000000"/>
+      <w:sz w:val="24"/>
+    </w:rPr>
+  </w:style>
   <w:style w:type="paragraph" w:customStyle="1" w:styleId="TOC1">
     <w:name w:val="TOC 1"/>
     <w:basedOn w:val="Normal"/>

</xml_diff>